<commit_message>
Update Doc Framework Basic
</commit_message>
<xml_diff>
--- a/Doc_Framework_Basic.docx
+++ b/Doc_Framework_Basic.docx
@@ -5650,6 +5650,9 @@
     </w:p>
     <w:p>
       <w:r>
+        <w:rPr>
+          <w:noProof/>
+        </w:rPr>
         <w:drawing>
           <wp:inline distT="0" distB="0" distL="0" distR="0" wp14:anchorId="55D2B9D4" wp14:editId="39E4E3DB">
             <wp:extent cx="5408930" cy="684530"/>
@@ -5697,6 +5700,9 @@
     </w:p>
     <w:p>
       <w:r>
+        <w:rPr>
+          <w:noProof/>
+        </w:rPr>
         <w:drawing>
           <wp:inline distT="0" distB="0" distL="0" distR="0" wp14:anchorId="6698DD2B" wp14:editId="1169B20F">
             <wp:extent cx="5380186" cy="693480"/>
@@ -6102,6 +6108,9 @@
         <w:jc w:val="center"/>
       </w:pPr>
       <w:r>
+        <w:rPr>
+          <w:noProof/>
+        </w:rPr>
         <w:drawing>
           <wp:inline distT="0" distB="0" distL="0" distR="0" wp14:anchorId="665A59D4" wp14:editId="3335010B">
             <wp:extent cx="4587638" cy="3063505"/>
@@ -6160,6 +6169,9 @@
         <w:jc w:val="center"/>
       </w:pPr>
       <w:r>
+        <w:rPr>
+          <w:noProof/>
+        </w:rPr>
         <w:drawing>
           <wp:inline distT="0" distB="0" distL="0" distR="0" wp14:anchorId="620BE64F" wp14:editId="5D23E270">
             <wp:extent cx="2864397" cy="2237509"/>
@@ -6494,6 +6506,53 @@
       </w:r>
     </w:p>
     <w:p>
+      <w:r>
+        <w:t>Híbrido LoRaWAN com LoRa</w:t>
+      </w:r>
+    </w:p>
+    <w:p>
+      <w:pPr>
+        <w:jc w:val="center"/>
+      </w:pPr>
+      <w:r>
+        <w:drawing>
+          <wp:inline distT="0" distB="0" distL="0" distR="0" wp14:anchorId="40D99C82" wp14:editId="317241A6">
+            <wp:extent cx="5408930" cy="2122170"/>
+            <wp:effectExtent l="0" t="0" r="1270" b="0"/>
+            <wp:docPr id="256041642" name="Imagem 1"/>
+            <wp:cNvGraphicFramePr>
+              <a:graphicFrameLocks xmlns:a="http://schemas.openxmlformats.org/drawingml/2006/main" noChangeAspect="1"/>
+            </wp:cNvGraphicFramePr>
+            <a:graphic xmlns:a="http://schemas.openxmlformats.org/drawingml/2006/main">
+              <a:graphicData uri="http://schemas.openxmlformats.org/drawingml/2006/picture">
+                <pic:pic xmlns:pic="http://schemas.openxmlformats.org/drawingml/2006/picture">
+                  <pic:nvPicPr>
+                    <pic:cNvPr id="256041642" name=""/>
+                    <pic:cNvPicPr/>
+                  </pic:nvPicPr>
+                  <pic:blipFill>
+                    <a:blip r:embed="rId36"/>
+                    <a:stretch>
+                      <a:fillRect/>
+                    </a:stretch>
+                  </pic:blipFill>
+                  <pic:spPr>
+                    <a:xfrm>
+                      <a:off x="0" y="0"/>
+                      <a:ext cx="5408930" cy="2122170"/>
+                    </a:xfrm>
+                    <a:prstGeom prst="rect">
+                      <a:avLst/>
+                    </a:prstGeom>
+                  </pic:spPr>
+                </pic:pic>
+              </a:graphicData>
+            </a:graphic>
+          </wp:inline>
+        </w:drawing>
+      </w:r>
+    </w:p>
+    <w:p>
       <w:pPr>
         <w:pStyle w:val="Ttulo2"/>
         <w:numPr>
@@ -6572,6 +6631,7 @@
       </w:pPr>
       <w:bookmarkStart w:id="20" w:name="_Toc231936149"/>
       <w:r>
+        <w:lastRenderedPageBreak/>
         <w:t xml:space="preserve">Camada física – </w:t>
       </w:r>
       <w:r>
@@ -6633,6 +6693,18 @@
       </w:pPr>
       <w:r>
         <w:t>WiFi</w:t>
+      </w:r>
+    </w:p>
+    <w:p>
+      <w:pPr>
+        <w:pStyle w:val="PargrafodaLista"/>
+        <w:numPr>
+          <w:ilvl w:val="0"/>
+          <w:numId w:val="23"/>
+        </w:numPr>
+      </w:pPr>
+      <w:r>
+        <w:t>Bluetooth</w:t>
       </w:r>
     </w:p>
     <w:p>
@@ -6679,7 +6751,6 @@
       </w:pPr>
       <w:bookmarkStart w:id="21" w:name="_Toc231936150"/>
       <w:r>
-        <w:lastRenderedPageBreak/>
         <w:t xml:space="preserve">Exemplo </w:t>
       </w:r>
       <w:r>
@@ -6708,6 +6779,9 @@
     </w:p>
     <w:p>
       <w:r>
+        <w:rPr>
+          <w:noProof/>
+        </w:rPr>
         <w:drawing>
           <wp:inline distT="0" distB="0" distL="0" distR="0" wp14:anchorId="7372CE9B" wp14:editId="04D7DB86">
             <wp:extent cx="5408930" cy="1752600"/>
@@ -6724,7 +6798,7 @@
                     <pic:cNvPicPr/>
                   </pic:nvPicPr>
                   <pic:blipFill>
-                    <a:blip r:embed="rId36"/>
+                    <a:blip r:embed="rId37"/>
                     <a:stretch>
                       <a:fillRect/>
                     </a:stretch>
@@ -6765,6 +6839,7 @@
       </w:pPr>
       <w:bookmarkStart w:id="22" w:name="_Toc231936151"/>
       <w:r>
+        <w:lastRenderedPageBreak/>
         <w:t>Definição dos Níveis</w:t>
       </w:r>
       <w:bookmarkEnd w:id="22"/>
@@ -6820,7 +6895,6 @@
     </w:p>
     <w:p>
       <w:r>
-        <w:lastRenderedPageBreak/>
         <w:t>O N4 é tem uma função lógica de armazenamento e estabelece a interface entre os níveis 3, 5 e 6</w:t>
       </w:r>
       <w:r>
@@ -6901,6 +6975,7 @@
     </w:p>
     <w:p>
       <w:r>
+        <w:lastRenderedPageBreak/>
         <w:t>O Nível 1 trata dos processos locais, no exemplo o acionamento do LED amarelo e a medida da luminosidade.</w:t>
       </w:r>
     </w:p>
@@ -6992,7 +7067,7 @@
                     <pic:cNvPicPr/>
                   </pic:nvPicPr>
                   <pic:blipFill>
-                    <a:blip r:embed="rId37"/>
+                    <a:blip r:embed="rId38"/>
                     <a:stretch>
                       <a:fillRect/>
                     </a:stretch>
@@ -7026,6 +7101,7 @@
     </w:p>
     <w:p>
       <w:r>
+        <w:lastRenderedPageBreak/>
         <w:t xml:space="preserve">A opção do cliente é escrita em um arquivo no Nível 4 com valor 0 para LED apagado e 1 para LED aceso. </w:t>
       </w:r>
     </w:p>
@@ -7062,7 +7138,6 @@
     </w:p>
     <w:p>
       <w:r>
-        <w:lastRenderedPageBreak/>
         <w:t xml:space="preserve">5 – Pacote sobe a pilha MoT do nó sensor e na camada de aplicação e aciona LED se byte 16 for 1 ou apaga se for zero. </w:t>
       </w:r>
     </w:p>
@@ -7145,6 +7220,7 @@
         </w:numPr>
       </w:pPr>
       <w:r>
+        <w:lastRenderedPageBreak/>
         <w:t>ESP32</w:t>
       </w:r>
     </w:p>
@@ -7165,6 +7241,9 @@
         <w:jc w:val="center"/>
       </w:pPr>
       <w:r>
+        <w:rPr>
+          <w:noProof/>
+        </w:rPr>
         <w:drawing>
           <wp:inline distT="0" distB="0" distL="0" distR="0" wp14:anchorId="0551FE66" wp14:editId="35994FCB">
             <wp:extent cx="1729890" cy="2080440"/>
@@ -7181,7 +7260,7 @@
                     <pic:cNvPicPr/>
                   </pic:nvPicPr>
                   <pic:blipFill>
-                    <a:blip r:embed="rId38"/>
+                    <a:blip r:embed="rId39"/>
                     <a:stretch>
                       <a:fillRect/>
                     </a:stretch>
@@ -7216,7 +7295,6 @@
         </w:numPr>
       </w:pPr>
       <w:r>
-        <w:lastRenderedPageBreak/>
         <w:t>Nível 1 que faz os processos locais</w:t>
       </w:r>
       <w:r>
@@ -7321,6 +7399,10 @@
         <w:jc w:val="center"/>
       </w:pPr>
       <w:r>
+        <w:rPr>
+          <w:noProof/>
+        </w:rPr>
+        <w:lastRenderedPageBreak/>
         <w:drawing>
           <wp:inline distT="0" distB="0" distL="0" distR="0" wp14:anchorId="55129D33" wp14:editId="08688DE8">
             <wp:extent cx="2709789" cy="2607357"/>
@@ -7337,7 +7419,7 @@
                     <pic:cNvPicPr/>
                   </pic:nvPicPr>
                   <pic:blipFill>
-                    <a:blip r:embed="rId39"/>
+                    <a:blip r:embed="rId40"/>
                     <a:stretch>
                       <a:fillRect/>
                     </a:stretch>
@@ -7419,10 +7501,15 @@
       </w:pPr>
       <w:bookmarkStart w:id="27" w:name="_Toc231936156"/>
       <w:r>
-        <w:lastRenderedPageBreak/>
+        <w:t xml:space="preserve">Aplicação </w:t>
+      </w:r>
+      <w:r>
         <w:t>Protocolo MoT</w:t>
       </w:r>
       <w:bookmarkEnd w:id="27"/>
+      <w:r>
+        <w:t xml:space="preserve"> no Kit-LoRa</w:t>
+      </w:r>
     </w:p>
     <w:p>
       <w:r>
@@ -7439,6 +7526,9 @@
         <w:jc w:val="center"/>
       </w:pPr>
       <w:r>
+        <w:rPr>
+          <w:noProof/>
+        </w:rPr>
         <w:drawing>
           <wp:inline distT="0" distB="0" distL="0" distR="0" wp14:anchorId="3EA3239A" wp14:editId="13999474">
             <wp:extent cx="3543607" cy="1501270"/>
@@ -7455,7 +7545,7 @@
                     <pic:cNvPicPr/>
                   </pic:nvPicPr>
                   <pic:blipFill>
-                    <a:blip r:embed="rId40"/>
+                    <a:blip r:embed="rId41"/>
                     <a:stretch>
                       <a:fillRect/>
                     </a:stretch>
@@ -7529,6 +7619,7 @@
         </w:numPr>
       </w:pPr>
       <w:r>
+        <w:lastRenderedPageBreak/>
         <w:t>Camada de aplicação</w:t>
       </w:r>
     </w:p>
@@ -7582,7 +7673,190 @@
     </w:p>
     <w:p>
       <w:r>
-        <w:lastRenderedPageBreak/>
+        <w:rPr>
+          <w:noProof/>
+        </w:rPr>
+        <mc:AlternateContent>
+          <mc:Choice Requires="wps">
+            <w:drawing>
+              <wp:anchor distT="0" distB="0" distL="114300" distR="114300" simplePos="0" relativeHeight="251732992" behindDoc="0" locked="0" layoutInCell="1" allowOverlap="1" wp14:anchorId="3162F02C" wp14:editId="567702FD">
+                <wp:simplePos x="0" y="0"/>
+                <wp:positionH relativeFrom="column">
+                  <wp:posOffset>-39275</wp:posOffset>
+                </wp:positionH>
+                <wp:positionV relativeFrom="paragraph">
+                  <wp:posOffset>1707218</wp:posOffset>
+                </wp:positionV>
+                <wp:extent cx="817123" cy="455457"/>
+                <wp:effectExtent l="0" t="0" r="21590" b="20955"/>
+                <wp:wrapNone/>
+                <wp:docPr id="82195964" name="Caixa de Texto 28"/>
+                <wp:cNvGraphicFramePr/>
+                <a:graphic xmlns:a="http://schemas.openxmlformats.org/drawingml/2006/main">
+                  <a:graphicData uri="http://schemas.microsoft.com/office/word/2010/wordprocessingShape">
+                    <wps:wsp>
+                      <wps:cNvSpPr txBox="1"/>
+                      <wps:spPr>
+                        <a:xfrm>
+                          <a:off x="0" y="0"/>
+                          <a:ext cx="817123" cy="455457"/>
+                        </a:xfrm>
+                        <a:prstGeom prst="rect">
+                          <a:avLst/>
+                        </a:prstGeom>
+                        <a:solidFill>
+                          <a:schemeClr val="lt1"/>
+                        </a:solidFill>
+                        <a:ln w="6350">
+                          <a:solidFill>
+                            <a:prstClr val="black"/>
+                          </a:solidFill>
+                        </a:ln>
+                      </wps:spPr>
+                      <wps:txbx>
+                        <w:txbxContent>
+                          <w:p>
+                            <w:pPr>
+                              <w:rPr>
+                                <w:color w:val="EE0000"/>
+                                <w:sz w:val="20"/>
+                                <w:szCs w:val="20"/>
+                              </w:rPr>
+                            </w:pPr>
+                            <w:r>
+                              <w:rPr>
+                                <w:color w:val="EE0000"/>
+                                <w:sz w:val="20"/>
+                                <w:szCs w:val="20"/>
+                              </w:rPr>
+                              <w:t>TIRAR ESP32</w:t>
+                            </w:r>
+                          </w:p>
+                        </w:txbxContent>
+                      </wps:txbx>
+                      <wps:bodyPr rot="0" spcFirstLastPara="0" vertOverflow="overflow" horzOverflow="overflow" vert="horz" wrap="square" lIns="91440" tIns="45720" rIns="91440" bIns="45720" numCol="1" spcCol="0" rtlCol="0" fromWordArt="0" anchor="t" anchorCtr="0" forceAA="0" compatLnSpc="1">
+                        <a:prstTxWarp prst="textNoShape">
+                          <a:avLst/>
+                        </a:prstTxWarp>
+                        <a:noAutofit/>
+                      </wps:bodyPr>
+                    </wps:wsp>
+                  </a:graphicData>
+                </a:graphic>
+              </wp:anchor>
+            </w:drawing>
+          </mc:Choice>
+          <mc:Fallback>
+            <w:pict>
+              <v:shapetype w14:anchorId="3162F02C" id="_x0000_t202" coordsize="21600,21600" o:spt="202" path="m,l,21600r21600,l21600,xe">
+                <v:stroke joinstyle="miter"/>
+                <v:path gradientshapeok="t" o:connecttype="rect"/>
+              </v:shapetype>
+              <v:shape id="Caixa de Texto 28" o:spid="_x0000_s1026" type="#_x0000_t202" style="position:absolute;left:0;text-align:left;margin-left:-3.1pt;margin-top:134.45pt;width:64.35pt;height:35.85pt;z-index:251732992;visibility:visible;mso-wrap-style:square;mso-wrap-distance-left:9pt;mso-wrap-distance-top:0;mso-wrap-distance-right:9pt;mso-wrap-distance-bottom:0;mso-position-horizontal:absolute;mso-position-horizontal-relative:text;mso-position-vertical:absolute;mso-position-vertical-relative:text;v-text-anchor:top" o:gfxdata="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" fillcolor="white [3201]" strokeweight=".5pt">
+                <v:textbox>
+                  <w:txbxContent>
+                    <w:p>
+                      <w:pPr>
+                        <w:rPr>
+                          <w:color w:val="EE0000"/>
+                          <w:sz w:val="20"/>
+                          <w:szCs w:val="20"/>
+                        </w:rPr>
+                      </w:pPr>
+                      <w:r>
+                        <w:rPr>
+                          <w:color w:val="EE0000"/>
+                          <w:sz w:val="20"/>
+                          <w:szCs w:val="20"/>
+                        </w:rPr>
+                        <w:t>TIRAR ESP32</w:t>
+                      </w:r>
+                    </w:p>
+                  </w:txbxContent>
+                </v:textbox>
+              </v:shape>
+            </w:pict>
+          </mc:Fallback>
+        </mc:AlternateContent>
+      </w:r>
+      <w:r>
+        <w:rPr>
+          <w:noProof/>
+        </w:rPr>
+        <mc:AlternateContent>
+          <mc:Choice Requires="wps">
+            <w:drawing>
+              <wp:anchor distT="0" distB="0" distL="114300" distR="114300" simplePos="0" relativeHeight="251731968" behindDoc="0" locked="0" layoutInCell="1" allowOverlap="1" wp14:anchorId="728FBEB0" wp14:editId="1B871660">
+                <wp:simplePos x="0" y="0"/>
+                <wp:positionH relativeFrom="column">
+                  <wp:posOffset>758393</wp:posOffset>
+                </wp:positionH>
+                <wp:positionV relativeFrom="paragraph">
+                  <wp:posOffset>1590486</wp:posOffset>
+                </wp:positionV>
+                <wp:extent cx="870625" cy="573932"/>
+                <wp:effectExtent l="95250" t="57150" r="100965" b="112395"/>
+                <wp:wrapNone/>
+                <wp:docPr id="80122214" name="Elipse 27"/>
+                <wp:cNvGraphicFramePr/>
+                <a:graphic xmlns:a="http://schemas.openxmlformats.org/drawingml/2006/main">
+                  <a:graphicData uri="http://schemas.microsoft.com/office/word/2010/wordprocessingShape">
+                    <wps:wsp>
+                      <wps:cNvSpPr/>
+                      <wps:spPr>
+                        <a:xfrm>
+                          <a:off x="0" y="0"/>
+                          <a:ext cx="870625" cy="573932"/>
+                        </a:xfrm>
+                        <a:prstGeom prst="ellipse">
+                          <a:avLst/>
+                        </a:prstGeom>
+                        <a:noFill/>
+                        <a:ln w="76200">
+                          <a:solidFill>
+                            <a:srgbClr val="EE0000"/>
+                          </a:solidFill>
+                        </a:ln>
+                      </wps:spPr>
+                      <wps:style>
+                        <a:lnRef idx="1">
+                          <a:schemeClr val="accent1"/>
+                        </a:lnRef>
+                        <a:fillRef idx="3">
+                          <a:schemeClr val="accent1"/>
+                        </a:fillRef>
+                        <a:effectRef idx="2">
+                          <a:schemeClr val="accent1"/>
+                        </a:effectRef>
+                        <a:fontRef idx="minor">
+                          <a:schemeClr val="lt1"/>
+                        </a:fontRef>
+                      </wps:style>
+                      <wps:bodyPr rot="0" spcFirstLastPara="0" vertOverflow="overflow" horzOverflow="overflow" vert="horz" wrap="square" lIns="91440" tIns="45720" rIns="91440" bIns="45720" numCol="1" spcCol="0" rtlCol="0" fromWordArt="0" anchor="ctr" anchorCtr="0" forceAA="0" compatLnSpc="1">
+                        <a:prstTxWarp prst="textNoShape">
+                          <a:avLst/>
+                        </a:prstTxWarp>
+                        <a:noAutofit/>
+                      </wps:bodyPr>
+                    </wps:wsp>
+                  </a:graphicData>
+                </a:graphic>
+              </wp:anchor>
+            </w:drawing>
+          </mc:Choice>
+          <mc:Fallback>
+            <w:pict>
+              <v:oval w14:anchorId="5D56D19B" id="Elipse 27" o:spid="_x0000_s1026" style="position:absolute;margin-left:59.7pt;margin-top:125.25pt;width:68.55pt;height:45.2pt;z-index:251731968;visibility:visible;mso-wrap-style:square;mso-wrap-distance-left:9pt;mso-wrap-distance-top:0;mso-wrap-distance-right:9pt;mso-wrap-distance-bottom:0;mso-position-horizontal:absolute;mso-position-horizontal-relative:text;mso-position-vertical:absolute;mso-position-vertical-relative:text;v-text-anchor:middle" o:gfxdata="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" filled="f" strokecolor="#e00" strokeweight="6pt">
+                <v:shadow on="t" color="black" opacity="22937f" origin=",.5" offset="0,.63889mm"/>
+              </v:oval>
+            </w:pict>
+          </mc:Fallback>
+        </mc:AlternateContent>
+      </w:r>
+      <w:r>
+        <w:rPr>
+          <w:noProof/>
+        </w:rPr>
         <w:drawing>
           <wp:inline distT="0" distB="0" distL="0" distR="0" wp14:anchorId="16C7D187" wp14:editId="0ABDEAE2">
             <wp:extent cx="5082980" cy="3010161"/>
@@ -7599,7 +7873,7 @@
                     <pic:cNvPicPr/>
                   </pic:nvPicPr>
                   <pic:blipFill>
-                    <a:blip r:embed="rId41"/>
+                    <a:blip r:embed="rId42"/>
                     <a:stretch>
                       <a:fillRect/>
                     </a:stretch>
@@ -7706,6 +7980,9 @@
         <w:jc w:val="center"/>
       </w:pPr>
       <w:r>
+        <w:rPr>
+          <w:noProof/>
+        </w:rPr>
         <w:drawing>
           <wp:inline distT="0" distB="0" distL="0" distR="0" wp14:anchorId="61A3C8EA" wp14:editId="635FAC05">
             <wp:extent cx="5387807" cy="586791"/>
@@ -7722,7 +7999,7 @@
                     <pic:cNvPicPr/>
                   </pic:nvPicPr>
                   <pic:blipFill>
-                    <a:blip r:embed="rId42"/>
+                    <a:blip r:embed="rId43"/>
                     <a:stretch>
                       <a:fillRect/>
                     </a:stretch>
@@ -7745,6 +8022,7 @@
     </w:p>
     <w:p>
       <w:r>
+        <w:lastRenderedPageBreak/>
         <w:t>Define-se p</w:t>
       </w:r>
       <w:r>
@@ -7762,7 +8040,9 @@
         <w:jc w:val="center"/>
       </w:pPr>
       <w:r>
-        <w:lastRenderedPageBreak/>
+        <w:rPr>
+          <w:noProof/>
+        </w:rPr>
         <w:drawing>
           <wp:inline distT="0" distB="0" distL="0" distR="0" wp14:anchorId="0A4098FD" wp14:editId="6B39E259">
             <wp:extent cx="5372566" cy="777307"/>
@@ -7779,7 +8059,7 @@
                     <pic:cNvPicPr/>
                   </pic:nvPicPr>
                   <pic:blipFill>
-                    <a:blip r:embed="rId43"/>
+                    <a:blip r:embed="rId44"/>
                     <a:stretch>
                       <a:fillRect/>
                     </a:stretch>
@@ -7810,6 +8090,9 @@
     </w:p>
     <w:p>
       <w:r>
+        <w:rPr>
+          <w:noProof/>
+        </w:rPr>
         <w:drawing>
           <wp:inline distT="0" distB="0" distL="0" distR="0" wp14:anchorId="2B2A97CB" wp14:editId="6B21B4D3">
             <wp:extent cx="5408930" cy="1097280"/>
@@ -7826,7 +8109,7 @@
                     <pic:cNvPicPr/>
                   </pic:nvPicPr>
                   <pic:blipFill>
-                    <a:blip r:embed="rId44"/>
+                    <a:blip r:embed="rId45"/>
                     <a:stretch>
                       <a:fillRect/>
                     </a:stretch>
@@ -7947,7 +8230,7 @@
                     <pic:cNvPicPr/>
                   </pic:nvPicPr>
                   <pic:blipFill>
-                    <a:blip r:embed="rId45"/>
+                    <a:blip r:embed="rId46"/>
                     <a:stretch>
                       <a:fillRect/>
                     </a:stretch>
@@ -8018,7 +8301,13 @@
         </w:numPr>
       </w:pPr>
       <w:r>
-        <w:t>Camada TRNSP – 4 bytes</w:t>
+        <w:t>Camada TR</w:t>
+      </w:r>
+      <w:r>
+        <w:t>A</w:t>
+      </w:r>
+      <w:r>
+        <w:t>NSP – 4 bytes</w:t>
       </w:r>
     </w:p>
     <w:p>
@@ -8043,12 +8332,12 @@
     </w:p>
     <w:p>
       <w:r>
+        <w:lastRenderedPageBreak/>
         <w:t>Observar que o número do byte vai de 0 a 19, portanto 20 bytes.</w:t>
       </w:r>
     </w:p>
     <w:p>
       <w:r>
-        <w:lastRenderedPageBreak/>
         <w:t>As informações que vão nos bytes de DL e UL são diferentes em função das necessidad</w:t>
       </w:r>
       <w:r>
@@ -8108,6 +8397,9 @@
         <w:jc w:val="center"/>
       </w:pPr>
       <w:r>
+        <w:rPr>
+          <w:noProof/>
+        </w:rPr>
         <w:drawing>
           <wp:inline distT="0" distB="0" distL="0" distR="0" wp14:anchorId="3B795F78" wp14:editId="3A505DE7">
             <wp:extent cx="1905165" cy="1196444"/>
@@ -8124,7 +8416,7 @@
                     <pic:cNvPicPr/>
                   </pic:nvPicPr>
                   <pic:blipFill>
-                    <a:blip r:embed="rId46"/>
+                    <a:blip r:embed="rId47"/>
                     <a:stretch>
                       <a:fillRect/>
                     </a:stretch>
@@ -8155,6 +8447,9 @@
         <w:jc w:val="center"/>
       </w:pPr>
       <w:r>
+        <w:rPr>
+          <w:noProof/>
+        </w:rPr>
         <w:drawing>
           <wp:inline distT="0" distB="0" distL="0" distR="0" wp14:anchorId="05E84C53" wp14:editId="3BC4C194">
             <wp:extent cx="1455546" cy="1729890"/>
@@ -8171,7 +8466,7 @@
                     <pic:cNvPicPr/>
                   </pic:nvPicPr>
                   <pic:blipFill>
-                    <a:blip r:embed="rId47"/>
+                    <a:blip r:embed="rId48"/>
                     <a:stretch>
                       <a:fillRect/>
                     </a:stretch>
@@ -8212,6 +8507,9 @@
         <w:jc w:val="center"/>
       </w:pPr>
       <w:r>
+        <w:rPr>
+          <w:noProof/>
+        </w:rPr>
         <w:drawing>
           <wp:inline distT="0" distB="0" distL="0" distR="0" wp14:anchorId="306A5823" wp14:editId="7AC3F341">
             <wp:extent cx="1607959" cy="579170"/>
@@ -8228,7 +8526,7 @@
                     <pic:cNvPicPr/>
                   </pic:nvPicPr>
                   <pic:blipFill>
-                    <a:blip r:embed="rId48"/>
+                    <a:blip r:embed="rId49"/>
                     <a:stretch>
                       <a:fillRect/>
                     </a:stretch>
@@ -8268,6 +8566,9 @@
         <w:jc w:val="center"/>
       </w:pPr>
       <w:r>
+        <w:rPr>
+          <w:noProof/>
+        </w:rPr>
         <w:drawing>
           <wp:inline distT="0" distB="0" distL="0" distR="0" wp14:anchorId="3F173E21" wp14:editId="79B74AA2">
             <wp:extent cx="1486029" cy="1150720"/>
@@ -8284,7 +8585,7 @@
                     <pic:cNvPicPr/>
                   </pic:nvPicPr>
                   <pic:blipFill>
-                    <a:blip r:embed="rId49"/>
+                    <a:blip r:embed="rId50"/>
                     <a:stretch>
                       <a:fillRect/>
                     </a:stretch>
@@ -8315,6 +8616,9 @@
         <w:jc w:val="center"/>
       </w:pPr>
       <w:r>
+        <w:rPr>
+          <w:noProof/>
+        </w:rPr>
         <w:drawing>
           <wp:inline distT="0" distB="0" distL="0" distR="0" wp14:anchorId="157C99C9" wp14:editId="682471AF">
             <wp:extent cx="1447925" cy="1127858"/>
@@ -8331,7 +8635,7 @@
                     <pic:cNvPicPr/>
                   </pic:nvPicPr>
                   <pic:blipFill>
-                    <a:blip r:embed="rId50"/>
+                    <a:blip r:embed="rId51"/>
                     <a:stretch>
                       <a:fillRect/>
                     </a:stretch>
@@ -8391,6 +8695,9 @@
         <w:jc w:val="center"/>
       </w:pPr>
       <w:r>
+        <w:rPr>
+          <w:noProof/>
+        </w:rPr>
         <w:drawing>
           <wp:inline distT="0" distB="0" distL="0" distR="0" wp14:anchorId="0F880B63" wp14:editId="71297F39">
             <wp:extent cx="2834886" cy="1729890"/>
@@ -8407,7 +8714,7 @@
                     <pic:cNvPicPr/>
                   </pic:nvPicPr>
                   <pic:blipFill>
-                    <a:blip r:embed="rId51"/>
+                    <a:blip r:embed="rId52"/>
                     <a:stretch>
                       <a:fillRect/>
                     </a:stretch>
@@ -8453,6 +8760,9 @@
         <w:jc w:val="center"/>
       </w:pPr>
       <w:r>
+        <w:rPr>
+          <w:noProof/>
+        </w:rPr>
         <w:drawing>
           <wp:inline distT="0" distB="0" distL="0" distR="0" wp14:anchorId="763C6D6F" wp14:editId="073F2AF9">
             <wp:extent cx="1196444" cy="281964"/>
@@ -8469,7 +8779,7 @@
                     <pic:cNvPicPr/>
                   </pic:nvPicPr>
                   <pic:blipFill>
-                    <a:blip r:embed="rId52"/>
+                    <a:blip r:embed="rId53"/>
                     <a:stretch>
                       <a:fillRect/>
                     </a:stretch>
@@ -8529,6 +8839,9 @@
     </w:p>
     <w:p>
       <w:r>
+        <w:rPr>
+          <w:noProof/>
+        </w:rPr>
         <w:drawing>
           <wp:inline distT="0" distB="0" distL="0" distR="0" wp14:anchorId="3236D103" wp14:editId="761B0DF1">
             <wp:extent cx="5408930" cy="2726055"/>
@@ -8545,7 +8858,7 @@
                     <pic:cNvPicPr/>
                   </pic:nvPicPr>
                   <pic:blipFill>
-                    <a:blip r:embed="rId53"/>
+                    <a:blip r:embed="rId54"/>
                     <a:stretch>
                       <a:fillRect/>
                     </a:stretch>
@@ -8583,6 +8896,9 @@
     </w:p>
     <w:p>
       <w:r>
+        <w:rPr>
+          <w:noProof/>
+        </w:rPr>
         <w:lastRenderedPageBreak/>
         <w:drawing>
           <wp:inline distT="0" distB="0" distL="0" distR="0" wp14:anchorId="41567609" wp14:editId="2CFB0F03">
@@ -8600,7 +8916,7 @@
                     <pic:cNvPicPr/>
                   </pic:nvPicPr>
                   <pic:blipFill>
-                    <a:blip r:embed="rId54"/>
+                    <a:blip r:embed="rId55"/>
                     <a:stretch>
                       <a:fillRect/>
                     </a:stretch>
@@ -8658,6 +8974,9 @@
         <w:jc w:val="center"/>
       </w:pPr>
       <w:r>
+        <w:rPr>
+          <w:noProof/>
+        </w:rPr>
         <w:drawing>
           <wp:inline distT="0" distB="0" distL="0" distR="0" wp14:anchorId="17C59E12" wp14:editId="134DE412">
             <wp:extent cx="647756" cy="251482"/>
@@ -8674,7 +8993,7 @@
                     <pic:cNvPicPr/>
                   </pic:nvPicPr>
                   <pic:blipFill>
-                    <a:blip r:embed="rId55"/>
+                    <a:blip r:embed="rId56"/>
                     <a:stretch>
                       <a:fillRect/>
                     </a:stretch>
@@ -8702,6 +9021,9 @@
     </w:p>
     <w:p>
       <w:r>
+        <w:rPr>
+          <w:noProof/>
+        </w:rPr>
         <w:drawing>
           <wp:inline distT="0" distB="0" distL="0" distR="0" wp14:anchorId="3876DDA6" wp14:editId="4322005F">
             <wp:extent cx="5128704" cy="3825572"/>
@@ -8718,7 +9040,7 @@
                     <pic:cNvPicPr/>
                   </pic:nvPicPr>
                   <pic:blipFill>
-                    <a:blip r:embed="rId56"/>
+                    <a:blip r:embed="rId57"/>
                     <a:stretch>
                       <a:fillRect/>
                     </a:stretch>
@@ -8770,6 +9092,9 @@
         <w:jc w:val="center"/>
       </w:pPr>
       <w:r>
+        <w:rPr>
+          <w:noProof/>
+        </w:rPr>
         <w:drawing>
           <wp:inline distT="0" distB="0" distL="0" distR="0" wp14:anchorId="61FED97F" wp14:editId="08EAD1E1">
             <wp:extent cx="2491956" cy="548688"/>
@@ -8786,7 +9111,7 @@
                     <pic:cNvPicPr/>
                   </pic:nvPicPr>
                   <pic:blipFill>
-                    <a:blip r:embed="rId57"/>
+                    <a:blip r:embed="rId58"/>
                     <a:stretch>
                       <a:fillRect/>
                     </a:stretch>
@@ -8848,7 +9173,7 @@
                     <pic:cNvPicPr/>
                   </pic:nvPicPr>
                   <pic:blipFill>
-                    <a:blip r:embed="rId58"/>
+                    <a:blip r:embed="rId59"/>
                     <a:stretch>
                       <a:fillRect/>
                     </a:stretch>
@@ -9051,7 +9376,7 @@
                     <pic:cNvPicPr/>
                   </pic:nvPicPr>
                   <pic:blipFill>
-                    <a:blip r:embed="rId59"/>
+                    <a:blip r:embed="rId60"/>
                     <a:stretch>
                       <a:fillRect/>
                     </a:stretch>
@@ -9108,6 +9433,9 @@
         <w:jc w:val="center"/>
       </w:pPr>
       <w:r>
+        <w:rPr>
+          <w:noProof/>
+        </w:rPr>
         <mc:AlternateContent>
           <mc:Choice Requires="wps">
             <w:drawing>
@@ -9179,6 +9507,9 @@
         </mc:AlternateContent>
       </w:r>
       <w:r>
+        <w:rPr>
+          <w:noProof/>
+        </w:rPr>
         <w:drawing>
           <wp:inline distT="0" distB="0" distL="0" distR="0" wp14:anchorId="588446F7" wp14:editId="696327D3">
             <wp:extent cx="1101356" cy="1052945"/>
@@ -9195,7 +9526,7 @@
                     <pic:cNvPicPr/>
                   </pic:nvPicPr>
                   <pic:blipFill>
-                    <a:blip r:embed="rId60"/>
+                    <a:blip r:embed="rId61"/>
                     <a:stretch>
                       <a:fillRect/>
                     </a:stretch>
@@ -9256,6 +9587,9 @@
         <w:jc w:val="center"/>
       </w:pPr>
       <w:r>
+        <w:rPr>
+          <w:noProof/>
+        </w:rPr>
         <mc:AlternateContent>
           <mc:Choice Requires="wps">
             <w:drawing>
@@ -9327,6 +9661,9 @@
         </mc:AlternateContent>
       </w:r>
       <w:r>
+        <w:rPr>
+          <w:noProof/>
+        </w:rPr>
         <w:drawing>
           <wp:inline distT="0" distB="0" distL="0" distR="0" wp14:anchorId="5A1F6B69" wp14:editId="5F79D6E4">
             <wp:extent cx="982532" cy="949037"/>
@@ -9343,7 +9680,7 @@
                     <pic:cNvPicPr/>
                   </pic:nvPicPr>
                   <pic:blipFill>
-                    <a:blip r:embed="rId61"/>
+                    <a:blip r:embed="rId62"/>
                     <a:stretch>
                       <a:fillRect/>
                     </a:stretch>
@@ -9381,6 +9718,9 @@
         <w:jc w:val="center"/>
       </w:pPr>
       <w:r>
+        <w:rPr>
+          <w:noProof/>
+        </w:rPr>
         <mc:AlternateContent>
           <mc:Choice Requires="wps">
             <w:drawing>
@@ -9452,6 +9792,9 @@
         </mc:AlternateContent>
       </w:r>
       <w:r>
+        <w:rPr>
+          <w:noProof/>
+        </w:rPr>
         <w:drawing>
           <wp:inline distT="0" distB="0" distL="0" distR="0" wp14:anchorId="51D03A9B" wp14:editId="530C56D5">
             <wp:extent cx="1077789" cy="976746"/>
@@ -9468,7 +9811,7 @@
                     <pic:cNvPicPr/>
                   </pic:nvPicPr>
                   <pic:blipFill>
-                    <a:blip r:embed="rId62"/>
+                    <a:blip r:embed="rId63"/>
                     <a:stretch>
                       <a:fillRect/>
                     </a:stretch>
@@ -9509,6 +9852,9 @@
     </w:p>
     <w:p>
       <w:r>
+        <w:rPr>
+          <w:noProof/>
+        </w:rPr>
         <mc:AlternateContent>
           <mc:Choice Requires="wps">
             <w:drawing>
@@ -9585,6 +9931,9 @@
         <w:jc w:val="center"/>
       </w:pPr>
       <w:r>
+        <w:rPr>
+          <w:noProof/>
+        </w:rPr>
         <w:drawing>
           <wp:inline distT="0" distB="0" distL="0" distR="0" wp14:anchorId="3ECE4C76" wp14:editId="2735341A">
             <wp:extent cx="2116976" cy="554182"/>
@@ -9601,7 +9950,7 @@
                     <pic:cNvPicPr/>
                   </pic:nvPicPr>
                   <pic:blipFill>
-                    <a:blip r:embed="rId63"/>
+                    <a:blip r:embed="rId64"/>
                     <a:stretch>
                       <a:fillRect/>
                     </a:stretch>
@@ -9630,6 +9979,9 @@
     <w:p/>
     <w:p>
       <w:r>
+        <w:rPr>
+          <w:noProof/>
+        </w:rPr>
         <mc:AlternateContent>
           <mc:Choice Requires="wps">
             <w:drawing>
@@ -9718,6 +10070,9 @@
         <w:jc w:val="center"/>
       </w:pPr>
       <w:r>
+        <w:rPr>
+          <w:noProof/>
+        </w:rPr>
         <w:drawing>
           <wp:inline distT="0" distB="0" distL="0" distR="0" wp14:anchorId="4C37C8F9" wp14:editId="2364C84B">
             <wp:extent cx="2305190" cy="741218"/>
@@ -9734,7 +10089,7 @@
                     <pic:cNvPicPr/>
                   </pic:nvPicPr>
                   <pic:blipFill>
-                    <a:blip r:embed="rId64"/>
+                    <a:blip r:embed="rId65"/>
                     <a:stretch>
                       <a:fillRect/>
                     </a:stretch>
@@ -9771,6 +10126,9 @@
     <w:p/>
     <w:p>
       <w:r>
+        <w:rPr>
+          <w:noProof/>
+        </w:rPr>
         <mc:AlternateContent>
           <mc:Choice Requires="wps">
             <w:drawing>
@@ -9904,11 +10262,7 @@
           </mc:Choice>
           <mc:Fallback>
             <w:pict>
-              <v:shapetype w14:anchorId="3E891A3E" id="_x0000_t202" coordsize="21600,21600" o:spt="202" path="m,l,21600r21600,l21600,xe">
-                <v:stroke joinstyle="miter"/>
-                <v:path gradientshapeok="t" o:connecttype="rect"/>
-              </v:shapetype>
-              <v:shape id="Caixa de Texto 5" o:spid="_x0000_s1026" type="#_x0000_t202" style="position:absolute;left:0;text-align:left;margin-left:184.35pt;margin-top:26.2pt;width:51.25pt;height:24pt;z-index:251711488;visibility:visible;mso-wrap-style:square;mso-wrap-distance-left:9pt;mso-wrap-distance-top:0;mso-wrap-distance-right:9pt;mso-wrap-distance-bottom:0;mso-position-horizontal:absolute;mso-position-horizontal-relative:text;mso-position-vertical:absolute;mso-position-vertical-relative:text;v-text-anchor:top" o:gfxdata="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" fillcolor="white [3201]" stroked="f" strokeweight=".5pt">
+              <v:shape w14:anchorId="3E891A3E" id="Caixa de Texto 5" o:spid="_x0000_s1027" type="#_x0000_t202" style="position:absolute;left:0;text-align:left;margin-left:184.35pt;margin-top:26.2pt;width:51.25pt;height:24pt;z-index:251711488;visibility:visible;mso-wrap-style:square;mso-wrap-distance-left:9pt;mso-wrap-distance-top:0;mso-wrap-distance-right:9pt;mso-wrap-distance-bottom:0;mso-position-horizontal:absolute;mso-position-horizontal-relative:text;mso-position-vertical:absolute;mso-position-vertical-relative:text;v-text-anchor:top" o:gfxdata="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" fillcolor="white [3201]" stroked="f" strokeweight=".5pt">
                 <v:textbox>
                   <w:txbxContent>
                     <w:p>
@@ -9929,6 +10283,9 @@
         <w:jc w:val="center"/>
       </w:pPr>
       <w:r>
+        <w:rPr>
+          <w:noProof/>
+        </w:rPr>
         <w:drawing>
           <wp:inline distT="0" distB="0" distL="0" distR="0" wp14:anchorId="25074D58" wp14:editId="1DBBE12F">
             <wp:extent cx="2565970" cy="759922"/>
@@ -9945,7 +10302,7 @@
                     <pic:cNvPicPr/>
                   </pic:nvPicPr>
                   <pic:blipFill>
-                    <a:blip r:embed="rId65"/>
+                    <a:blip r:embed="rId66"/>
                     <a:stretch>
                       <a:fillRect/>
                     </a:stretch>
@@ -9977,6 +10334,9 @@
         <w:jc w:val="center"/>
       </w:pPr>
       <w:r>
+        <w:rPr>
+          <w:noProof/>
+        </w:rPr>
         <w:drawing>
           <wp:inline distT="0" distB="0" distL="0" distR="0" wp14:anchorId="2B0A1436" wp14:editId="7FA4286A">
             <wp:extent cx="1466263" cy="1440873"/>
@@ -9993,7 +10353,7 @@
                     <pic:cNvPicPr/>
                   </pic:nvPicPr>
                   <pic:blipFill>
-                    <a:blip r:embed="rId66"/>
+                    <a:blip r:embed="rId67"/>
                     <a:stretch>
                       <a:fillRect/>
                     </a:stretch>
@@ -10045,6 +10405,9 @@
     </w:p>
     <w:p>
       <w:r>
+        <w:rPr>
+          <w:noProof/>
+        </w:rPr>
         <mc:AlternateContent>
           <mc:Choice Requires="wps">
             <w:drawing>
@@ -10127,6 +10490,9 @@
         <w:jc w:val="center"/>
       </w:pPr>
       <w:r>
+        <w:rPr>
+          <w:noProof/>
+        </w:rPr>
         <w:drawing>
           <wp:inline distT="0" distB="0" distL="0" distR="0" wp14:anchorId="627D68E6" wp14:editId="05BFF8D2">
             <wp:extent cx="2936098" cy="658091"/>
@@ -10143,7 +10509,7 @@
                     <pic:cNvPicPr/>
                   </pic:nvPicPr>
                   <pic:blipFill>
-                    <a:blip r:embed="rId67"/>
+                    <a:blip r:embed="rId68"/>
                     <a:stretch>
                       <a:fillRect/>
                     </a:stretch>
@@ -10188,6 +10554,9 @@
         <w:jc w:val="center"/>
       </w:pPr>
       <w:r>
+        <w:rPr>
+          <w:noProof/>
+        </w:rPr>
         <mc:AlternateContent>
           <mc:Choice Requires="wps">
             <w:drawing>
@@ -10259,6 +10628,9 @@
         </mc:AlternateContent>
       </w:r>
       <w:r>
+        <w:rPr>
+          <w:noProof/>
+        </w:rPr>
         <w:drawing>
           <wp:inline distT="0" distB="0" distL="0" distR="0" wp14:anchorId="5F0C3661" wp14:editId="294557DF">
             <wp:extent cx="1149800" cy="1239982"/>
@@ -10275,7 +10647,7 @@
                     <pic:cNvPicPr/>
                   </pic:nvPicPr>
                   <pic:blipFill>
-                    <a:blip r:embed="rId68"/>
+                    <a:blip r:embed="rId69"/>
                     <a:stretch>
                       <a:fillRect/>
                     </a:stretch>
@@ -10298,6 +10670,9 @@
     </w:p>
     <w:p>
       <w:r>
+        <w:rPr>
+          <w:noProof/>
+        </w:rPr>
         <mc:AlternateContent>
           <mc:Choice Requires="wps">
             <w:drawing>
@@ -10386,6 +10761,9 @@
         <w:jc w:val="center"/>
       </w:pPr>
       <w:r>
+        <w:rPr>
+          <w:noProof/>
+        </w:rPr>
         <w:drawing>
           <wp:inline distT="0" distB="0" distL="0" distR="0" wp14:anchorId="28524DD8" wp14:editId="01B3B3CB">
             <wp:extent cx="1166750" cy="907473"/>
@@ -10402,7 +10780,7 @@
                     <pic:cNvPicPr/>
                   </pic:nvPicPr>
                   <pic:blipFill>
-                    <a:blip r:embed="rId69"/>
+                    <a:blip r:embed="rId70"/>
                     <a:stretch>
                       <a:fillRect/>
                     </a:stretch>
@@ -10430,6 +10808,9 @@
     </w:p>
     <w:p>
       <w:r>
+        <w:rPr>
+          <w:noProof/>
+        </w:rPr>
         <mc:AlternateContent>
           <mc:Choice Requires="wps">
             <w:drawing>
@@ -10518,6 +10899,9 @@
         <w:jc w:val="center"/>
       </w:pPr>
       <w:r>
+        <w:rPr>
+          <w:noProof/>
+        </w:rPr>
         <w:drawing>
           <wp:inline distT="0" distB="0" distL="0" distR="0" wp14:anchorId="564BC972" wp14:editId="12DED837">
             <wp:extent cx="979283" cy="838200"/>
@@ -10534,7 +10918,7 @@
                     <pic:cNvPicPr/>
                   </pic:nvPicPr>
                   <pic:blipFill>
-                    <a:blip r:embed="rId70"/>
+                    <a:blip r:embed="rId71"/>
                     <a:stretch>
                       <a:fillRect/>
                     </a:stretch>
@@ -10580,6 +10964,9 @@
         <w:jc w:val="center"/>
       </w:pPr>
       <w:r>
+        <w:rPr>
+          <w:noProof/>
+        </w:rPr>
         <w:lastRenderedPageBreak/>
         <mc:AlternateContent>
           <mc:Choice Requires="wps">
@@ -10652,6 +11039,9 @@
         </mc:AlternateContent>
       </w:r>
       <w:r>
+        <w:rPr>
+          <w:noProof/>
+        </w:rPr>
         <w:drawing>
           <wp:inline distT="0" distB="0" distL="0" distR="0" wp14:anchorId="504635E7" wp14:editId="13B4CB2B">
             <wp:extent cx="1016206" cy="1073727"/>
@@ -10668,7 +11058,7 @@
                     <pic:cNvPicPr/>
                   </pic:nvPicPr>
                   <pic:blipFill>
-                    <a:blip r:embed="rId71"/>
+                    <a:blip r:embed="rId72"/>
                     <a:stretch>
                       <a:fillRect/>
                     </a:stretch>
@@ -10727,6 +11117,9 @@
         <w:jc w:val="center"/>
       </w:pPr>
       <w:r>
+        <w:rPr>
+          <w:noProof/>
+        </w:rPr>
         <w:drawing>
           <wp:inline distT="0" distB="0" distL="0" distR="0" wp14:anchorId="10CBE6C0" wp14:editId="79601888">
             <wp:extent cx="2476715" cy="571550"/>
@@ -10743,7 +11136,7 @@
                     <pic:cNvPicPr/>
                   </pic:nvPicPr>
                   <pic:blipFill>
-                    <a:blip r:embed="rId72"/>
+                    <a:blip r:embed="rId73"/>
                     <a:stretch>
                       <a:fillRect/>
                     </a:stretch>
@@ -10794,7 +11187,7 @@
                     <pic:cNvPicPr/>
                   </pic:nvPicPr>
                   <pic:blipFill>
-                    <a:blip r:embed="rId73"/>
+                    <a:blip r:embed="rId74"/>
                     <a:stretch>
                       <a:fillRect/>
                     </a:stretch>
@@ -10834,6 +11227,9 @@
         <w:jc w:val="center"/>
       </w:pPr>
       <w:r>
+        <w:rPr>
+          <w:noProof/>
+        </w:rPr>
         <mc:AlternateContent>
           <mc:Choice Requires="wps">
             <w:drawing>
@@ -10905,6 +11301,9 @@
         </mc:AlternateContent>
       </w:r>
       <w:r>
+        <w:rPr>
+          <w:noProof/>
+        </w:rPr>
         <w:drawing>
           <wp:inline distT="0" distB="0" distL="0" distR="0" wp14:anchorId="6C1EC5F0" wp14:editId="2F3223CD">
             <wp:extent cx="1068655" cy="1129145"/>
@@ -10921,7 +11320,7 @@
                     <pic:cNvPicPr/>
                   </pic:nvPicPr>
                   <pic:blipFill>
-                    <a:blip r:embed="rId74"/>
+                    <a:blip r:embed="rId75"/>
                     <a:stretch>
                       <a:fillRect/>
                     </a:stretch>
@@ -10976,6 +11375,9 @@
         <w:jc w:val="center"/>
       </w:pPr>
       <w:r>
+        <w:rPr>
+          <w:noProof/>
+        </w:rPr>
         <w:lastRenderedPageBreak/>
         <mc:AlternateContent>
           <mc:Choice Requires="wps">
@@ -11048,6 +11450,9 @@
         </mc:AlternateContent>
       </w:r>
       <w:r>
+        <w:rPr>
+          <w:noProof/>
+        </w:rPr>
         <w:drawing>
           <wp:inline distT="0" distB="0" distL="0" distR="0" wp14:anchorId="241AA29A" wp14:editId="2927E0AB">
             <wp:extent cx="1080655" cy="1080655"/>
@@ -11064,7 +11469,7 @@
                     <pic:cNvPicPr/>
                   </pic:nvPicPr>
                   <pic:blipFill>
-                    <a:blip r:embed="rId75"/>
+                    <a:blip r:embed="rId76"/>
                     <a:stretch>
                       <a:fillRect/>
                     </a:stretch>
@@ -11111,6 +11516,9 @@
         <w:jc w:val="center"/>
       </w:pPr>
       <w:r>
+        <w:rPr>
+          <w:noProof/>
+        </w:rPr>
         <mc:AlternateContent>
           <mc:Choice Requires="wps">
             <w:drawing>
@@ -11182,6 +11590,9 @@
         </mc:AlternateContent>
       </w:r>
       <w:r>
+        <w:rPr>
+          <w:noProof/>
+        </w:rPr>
         <w:drawing>
           <wp:inline distT="0" distB="0" distL="0" distR="0" wp14:anchorId="3ADF40D7" wp14:editId="57D54D14">
             <wp:extent cx="1120140" cy="1120140"/>
@@ -11198,7 +11609,7 @@
                     <pic:cNvPicPr/>
                   </pic:nvPicPr>
                   <pic:blipFill>
-                    <a:blip r:embed="rId76"/>
+                    <a:blip r:embed="rId77"/>
                     <a:stretch>
                       <a:fillRect/>
                     </a:stretch>
@@ -11229,6 +11640,9 @@
         <w:jc w:val="center"/>
       </w:pPr>
       <w:r>
+        <w:rPr>
+          <w:noProof/>
+        </w:rPr>
         <mc:AlternateContent>
           <mc:Choice Requires="wps">
             <w:drawing>
@@ -11300,6 +11714,9 @@
         </mc:AlternateContent>
       </w:r>
       <w:r>
+        <w:rPr>
+          <w:noProof/>
+        </w:rPr>
         <w:drawing>
           <wp:inline distT="0" distB="0" distL="0" distR="0" wp14:anchorId="604F7F21" wp14:editId="3573DE79">
             <wp:extent cx="1091046" cy="1122219"/>
@@ -11316,7 +11733,7 @@
                     <pic:cNvPicPr/>
                   </pic:nvPicPr>
                   <pic:blipFill>
-                    <a:blip r:embed="rId77"/>
+                    <a:blip r:embed="rId78"/>
                     <a:stretch>
                       <a:fillRect/>
                     </a:stretch>
@@ -11347,6 +11764,9 @@
         <w:jc w:val="center"/>
       </w:pPr>
       <w:r>
+        <w:rPr>
+          <w:noProof/>
+        </w:rPr>
         <w:drawing>
           <wp:inline distT="0" distB="0" distL="0" distR="0" wp14:anchorId="6D25213A" wp14:editId="1FD1AB43">
             <wp:extent cx="2355272" cy="549909"/>
@@ -11363,7 +11783,7 @@
                     <pic:cNvPicPr/>
                   </pic:nvPicPr>
                   <pic:blipFill>
-                    <a:blip r:embed="rId78"/>
+                    <a:blip r:embed="rId79"/>
                     <a:stretch>
                       <a:fillRect/>
                     </a:stretch>
@@ -11389,6 +11809,9 @@
         <w:jc w:val="center"/>
       </w:pPr>
       <w:r>
+        <w:rPr>
+          <w:noProof/>
+        </w:rPr>
         <mc:AlternateContent>
           <mc:Choice Requires="wps">
             <w:drawing>
@@ -11478,6 +11901,9 @@
         <w:jc w:val="center"/>
       </w:pPr>
       <w:r>
+        <w:rPr>
+          <w:noProof/>
+        </w:rPr>
         <mc:AlternateContent>
           <mc:Choice Requires="wps">
             <w:drawing>
@@ -11550,6 +11976,9 @@
         </mc:AlternateContent>
       </w:r>
       <w:r>
+        <w:rPr>
+          <w:noProof/>
+        </w:rPr>
         <w:drawing>
           <wp:inline distT="0" distB="0" distL="0" distR="0" wp14:anchorId="517024DC" wp14:editId="778831FF">
             <wp:extent cx="2453622" cy="642159"/>
@@ -11566,7 +11995,7 @@
                     <pic:cNvPicPr/>
                   </pic:nvPicPr>
                   <pic:blipFill>
-                    <a:blip r:embed="rId79"/>
+                    <a:blip r:embed="rId80"/>
                     <a:stretch>
                       <a:fillRect/>
                     </a:stretch>
@@ -11695,7 +12124,6 @@
                                 <w:szCs w:val="22"/>
                               </w:rPr>
                             </w:pPr>
-                            <w:proofErr w:type="spellStart"/>
                             <w:r>
                               <w:rPr>
                                 <w:sz w:val="22"/>
@@ -11703,7 +12131,6 @@
                               </w:rPr>
                               <w:t>SNR</w:t>
                             </w:r>
-                            <w:proofErr w:type="spellEnd"/>
                           </w:p>
                         </w:txbxContent>
                       </wps:txbx>
@@ -11727,7 +12154,7 @@
           </mc:Choice>
           <mc:Fallback>
             <w:pict>
-              <v:shape w14:anchorId="559AC3D2" id="Caixa de Texto 6" o:spid="_x0000_s1027" type="#_x0000_t202" style="position:absolute;left:0;text-align:left;margin-left:194.2pt;margin-top:57.3pt;width:69.25pt;height:54.55pt;z-index:251718656;visibility:visible;mso-wrap-style:square;mso-width-percent:0;mso-height-percent:0;mso-wrap-distance-left:9pt;mso-wrap-distance-top:0;mso-wrap-distance-right:9pt;mso-wrap-distance-bottom:0;mso-position-horizontal:absolute;mso-position-horizontal-relative:text;mso-position-vertical:absolute;mso-position-vertical-relative:text;mso-width-percent:0;mso-height-percent:0;mso-width-relative:margin;mso-height-relative:margin;v-text-anchor:top" o:gfxdata="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" fillcolor="white [3201]" stroked="f" strokeweight=".5pt">
+              <v:shape w14:anchorId="559AC3D2" id="Caixa de Texto 6" o:spid="_x0000_s1028" type="#_x0000_t202" style="position:absolute;left:0;text-align:left;margin-left:194.2pt;margin-top:57.3pt;width:69.25pt;height:54.55pt;z-index:251718656;visibility:visible;mso-wrap-style:square;mso-width-percent:0;mso-height-percent:0;mso-wrap-distance-left:9pt;mso-wrap-distance-top:0;mso-wrap-distance-right:9pt;mso-wrap-distance-bottom:0;mso-position-horizontal:absolute;mso-position-horizontal-relative:text;mso-position-vertical:absolute;mso-position-vertical-relative:text;mso-width-percent:0;mso-height-percent:0;mso-width-relative:margin;mso-height-relative:margin;v-text-anchor:top" o:gfxdata="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" fillcolor="white [3201]" stroked="f" strokeweight=".5pt">
                 <v:textbox>
                   <w:txbxContent>
                     <w:p>
@@ -11780,7 +12207,6 @@
                           <w:szCs w:val="22"/>
                         </w:rPr>
                       </w:pPr>
-                      <w:proofErr w:type="spellStart"/>
                       <w:r>
                         <w:rPr>
                           <w:sz w:val="22"/>
@@ -11788,7 +12214,6 @@
                         </w:rPr>
                         <w:t>SNR</w:t>
                       </w:r>
-                      <w:proofErr w:type="spellEnd"/>
                     </w:p>
                   </w:txbxContent>
                 </v:textbox>
@@ -11798,6 +12223,9 @@
         </mc:AlternateContent>
       </w:r>
       <w:r>
+        <w:rPr>
+          <w:noProof/>
+        </w:rPr>
         <w:drawing>
           <wp:inline distT="0" distB="0" distL="0" distR="0" wp14:anchorId="2BFB662E" wp14:editId="297BF90B">
             <wp:extent cx="1233713" cy="706581"/>
@@ -11814,7 +12242,7 @@
                     <pic:cNvPicPr/>
                   </pic:nvPicPr>
                   <pic:blipFill>
-                    <a:blip r:embed="rId80"/>
+                    <a:blip r:embed="rId81"/>
                     <a:stretch>
                       <a:fillRect/>
                     </a:stretch>
@@ -11859,6 +12287,9 @@
         <w:jc w:val="center"/>
       </w:pPr>
       <w:r>
+        <w:rPr>
+          <w:noProof/>
+        </w:rPr>
         <mc:AlternateContent>
           <mc:Choice Requires="wps">
             <w:drawing>
@@ -11930,6 +12361,9 @@
         </mc:AlternateContent>
       </w:r>
       <w:r>
+        <w:rPr>
+          <w:noProof/>
+        </w:rPr>
         <w:drawing>
           <wp:inline distT="0" distB="0" distL="0" distR="0" wp14:anchorId="05562368" wp14:editId="6CD01149">
             <wp:extent cx="1964037" cy="707967"/>
@@ -11946,7 +12380,7 @@
                     <pic:cNvPicPr/>
                   </pic:nvPicPr>
                   <pic:blipFill>
-                    <a:blip r:embed="rId81"/>
+                    <a:blip r:embed="rId82"/>
                     <a:stretch>
                       <a:fillRect/>
                     </a:stretch>
@@ -12065,6 +12499,9 @@
         <w:jc w:val="center"/>
       </w:pPr>
       <w:r>
+        <w:rPr>
+          <w:noProof/>
+        </w:rPr>
         <w:lastRenderedPageBreak/>
         <mc:AlternateContent>
           <mc:Choice Requires="wps">
@@ -12137,6 +12574,9 @@
         </mc:AlternateContent>
       </w:r>
       <w:r>
+        <w:rPr>
+          <w:noProof/>
+        </w:rPr>
         <w:drawing>
           <wp:inline distT="0" distB="0" distL="0" distR="0" wp14:anchorId="3473B78B" wp14:editId="614CD00A">
             <wp:extent cx="1795549" cy="465513"/>
@@ -12153,7 +12593,7 @@
                     <pic:cNvPicPr/>
                   </pic:nvPicPr>
                   <pic:blipFill>
-                    <a:blip r:embed="rId82"/>
+                    <a:blip r:embed="rId83"/>
                     <a:stretch>
                       <a:fillRect/>
                     </a:stretch>
@@ -12198,6 +12638,9 @@
         <w:jc w:val="center"/>
       </w:pPr>
       <w:r>
+        <w:rPr>
+          <w:noProof/>
+        </w:rPr>
         <mc:AlternateContent>
           <mc:Choice Requires="wps">
             <w:drawing>
@@ -12269,6 +12712,9 @@
         </mc:AlternateContent>
       </w:r>
       <w:r>
+        <w:rPr>
+          <w:noProof/>
+        </w:rPr>
         <w:drawing>
           <wp:inline distT="0" distB="0" distL="0" distR="0" wp14:anchorId="3B57B4EE" wp14:editId="1D4A3C65">
             <wp:extent cx="1203913" cy="1163782"/>
@@ -12285,7 +12731,7 @@
                     <pic:cNvPicPr/>
                   </pic:nvPicPr>
                   <pic:blipFill>
-                    <a:blip r:embed="rId83"/>
+                    <a:blip r:embed="rId84"/>
                     <a:stretch>
                       <a:fillRect/>
                     </a:stretch>
@@ -12313,6 +12759,9 @@
     </w:p>
     <w:p>
       <w:r>
+        <w:rPr>
+          <w:noProof/>
+        </w:rPr>
         <mc:AlternateContent>
           <mc:Choice Requires="wps">
             <w:drawing>
@@ -12401,6 +12850,9 @@
         <w:jc w:val="center"/>
       </w:pPr>
       <w:r>
+        <w:rPr>
+          <w:noProof/>
+        </w:rPr>
         <w:drawing>
           <wp:inline distT="0" distB="0" distL="0" distR="0" wp14:anchorId="52B4B3EF" wp14:editId="2DF2B9B3">
             <wp:extent cx="1052225" cy="953886"/>
@@ -12417,7 +12869,7 @@
                     <pic:cNvPicPr/>
                   </pic:nvPicPr>
                   <pic:blipFill>
-                    <a:blip r:embed="rId84"/>
+                    <a:blip r:embed="rId85"/>
                     <a:stretch>
                       <a:fillRect/>
                     </a:stretch>
@@ -12451,6 +12903,9 @@
         <w:jc w:val="center"/>
       </w:pPr>
       <w:r>
+        <w:rPr>
+          <w:noProof/>
+        </w:rPr>
         <mc:AlternateContent>
           <mc:Choice Requires="wps">
             <w:drawing>
@@ -12522,6 +12977,9 @@
         </mc:AlternateContent>
       </w:r>
       <w:r>
+        <w:rPr>
+          <w:noProof/>
+        </w:rPr>
         <w:drawing>
           <wp:inline distT="0" distB="0" distL="0" distR="0" wp14:anchorId="78C2CCE8" wp14:editId="326F6EA4">
             <wp:extent cx="944848" cy="955964"/>
@@ -12538,7 +12996,7 @@
                     <pic:cNvPicPr/>
                   </pic:nvPicPr>
                   <pic:blipFill>
-                    <a:blip r:embed="rId85"/>
+                    <a:blip r:embed="rId86"/>
                     <a:stretch>
                       <a:fillRect/>
                     </a:stretch>
@@ -12588,6 +13046,9 @@
         <w:jc w:val="center"/>
       </w:pPr>
       <w:r>
+        <w:rPr>
+          <w:noProof/>
+        </w:rPr>
         <w:lastRenderedPageBreak/>
         <mc:AlternateContent>
           <mc:Choice Requires="wps">
@@ -12660,6 +13121,9 @@
         </mc:AlternateContent>
       </w:r>
       <w:r>
+        <w:rPr>
+          <w:noProof/>
+        </w:rPr>
         <w:drawing>
           <wp:inline distT="0" distB="0" distL="0" distR="0" wp14:anchorId="59FD2C8A" wp14:editId="60A27DD3">
             <wp:extent cx="1165961" cy="1234547"/>
@@ -12676,7 +13140,7 @@
                     <pic:cNvPicPr/>
                   </pic:nvPicPr>
                   <pic:blipFill>
-                    <a:blip r:embed="rId86"/>
+                    <a:blip r:embed="rId87"/>
                     <a:stretch>
                       <a:fillRect/>
                     </a:stretch>
@@ -12751,6 +13215,9 @@
         <w:jc w:val="center"/>
       </w:pPr>
       <w:r>
+        <w:rPr>
+          <w:noProof/>
+        </w:rPr>
         <w:drawing>
           <wp:inline distT="0" distB="0" distL="0" distR="0" wp14:anchorId="38FEDC01" wp14:editId="244ADE31">
             <wp:extent cx="3124471" cy="2072820"/>
@@ -12767,7 +13234,7 @@
                     <pic:cNvPicPr/>
                   </pic:nvPicPr>
                   <pic:blipFill>
-                    <a:blip r:embed="rId87"/>
+                    <a:blip r:embed="rId88"/>
                     <a:stretch>
                       <a:fillRect/>
                     </a:stretch>
@@ -12792,8 +13259,8 @@
     <w:p/>
     <w:p/>
     <w:sectPr>
-      <w:headerReference w:type="default" r:id="rId88"/>
-      <w:footerReference w:type="default" r:id="rId89"/>
+      <w:headerReference w:type="default" r:id="rId89"/>
+      <w:footerReference w:type="default" r:id="rId90"/>
       <w:pgSz w:w="11920" w:h="16840"/>
       <w:pgMar w:top="1417" w:right="1701" w:bottom="1417" w:left="1701" w:header="708" w:footer="708" w:gutter="0"/>
       <w:pgNumType w:start="1"/>
@@ -18335,6 +18802,7 @@
   <w:style w:type="character" w:default="1" w:styleId="Fontepargpadro">
     <w:name w:val="Default Paragraph Font"/>
     <w:uiPriority w:val="1"/>
+    <w:semiHidden/>
     <w:unhideWhenUsed/>
   </w:style>
   <w:style w:type="table" w:default="1" w:styleId="Tabelanormal">

</xml_diff>